<commit_message>
added week 6 meeting minutes
</commit_message>
<xml_diff>
--- a/Meeting_Minutes/Team meetings/Team Meeting Minutes Week 6.docx
+++ b/Meeting_Minutes/Team meetings/Team Meeting Minutes Week 6.docx
@@ -60,7 +60,10 @@
               <w:t xml:space="preserve"> </w:t>
             </w:r>
             <w:r>
-              <w:t>11</w:t>
+              <w:t>1</w:t>
+            </w:r>
+            <w:r>
+              <w:t>8</w:t>
             </w:r>
             <w:r>
               <w:t>/0</w:t>
@@ -94,10 +97,13 @@
               <w:t xml:space="preserve"> </w:t>
             </w:r>
             <w:r>
-              <w:t>11</w:t>
-            </w:r>
-            <w:r>
-              <w:t>:00</w:t>
+              <w:t>10</w:t>
+            </w:r>
+            <w:r>
+              <w:t>:</w:t>
+            </w:r>
+            <w:r>
+              <w:t>15</w:t>
             </w:r>
             <w:r>
               <w:t>AM</w:t>
@@ -418,7 +424,13 @@
               <w:rPr>
                 <w:b/>
               </w:rPr>
-              <w:t>Assign work for this week, assess progress</w:t>
+              <w:t>Assess work done and work needed to complete proposal, organize weekly meetings</w:t>
+            </w:r>
+            <w:r>
+              <w:rPr>
+                <w:b/>
+              </w:rPr>
+              <w:t>, audit weekly logs</w:t>
             </w:r>
           </w:p>
         </w:tc>
@@ -535,7 +547,7 @@
           </w:tcPr>
           <w:p>
             <w:r>
-              <w:t>State of the project</w:t>
+              <w:t>Discuss what was done yesterday to further the proposal</w:t>
             </w:r>
           </w:p>
         </w:tc>
@@ -588,7 +600,13 @@
           </w:tcPr>
           <w:p>
             <w:r>
-              <w:t>Weekly logs/auditing</w:t>
+              <w:t xml:space="preserve">Agree upon meeting time with clement, discuss email to </w:t>
+            </w:r>
+            <w:r>
+              <w:t>B</w:t>
+            </w:r>
+            <w:r>
+              <w:t>ryce</w:t>
             </w:r>
           </w:p>
         </w:tc>
@@ -620,7 +638,7 @@
           </w:tcPr>
           <w:p>
             <w:r>
-              <w:t>10</w:t>
+              <w:t>5</w:t>
             </w:r>
           </w:p>
         </w:tc>
@@ -641,10 +659,7 @@
           </w:tcPr>
           <w:p>
             <w:r>
-              <w:t>Delegate work</w:t>
-            </w:r>
-            <w:r>
-              <w:t>, gain some experience this week in configuring and running AI forensics tools</w:t>
+              <w:t>Discussing each tool we worked on, what they do</w:t>
             </w:r>
           </w:p>
         </w:tc>
@@ -660,7 +675,7 @@
           </w:tcPr>
           <w:p>
             <w:r>
-              <w:t>MB</w:t>
+              <w:t>MB, OH, SD</w:t>
             </w:r>
           </w:p>
         </w:tc>
@@ -676,7 +691,7 @@
           </w:tcPr>
           <w:p>
             <w:r>
-              <w:t>15</w:t>
+              <w:t>10</w:t>
             </w:r>
           </w:p>
         </w:tc>
@@ -697,7 +712,7 @@
           </w:tcPr>
           <w:p>
             <w:r>
-              <w:t>Kanban as a methodology</w:t>
+              <w:t>how we can describe the fundamental core of the project to a layman</w:t>
             </w:r>
           </w:p>
         </w:tc>
@@ -729,7 +744,7 @@
           </w:tcPr>
           <w:p>
             <w:r>
-              <w:t>15</w:t>
+              <w:t>10</w:t>
             </w:r>
           </w:p>
         </w:tc>
@@ -750,7 +765,7 @@
           </w:tcPr>
           <w:p>
             <w:r>
-              <w:t>On hand look at sqlite model running in lmstudio</w:t>
+              <w:t>Discuss proposal feedback</w:t>
             </w:r>
           </w:p>
         </w:tc>
@@ -766,6 +781,112 @@
           </w:tcPr>
           <w:p>
             <w:r>
+              <w:t>DS</w:t>
+            </w:r>
+          </w:p>
+        </w:tc>
+        <w:tc>
+          <w:tcPr>
+            <w:tcW w:w="1529" w:type="dxa"/>
+            <w:tcBorders>
+              <w:top w:val="single" w:sz="4" w:space="0" w:color="000000"/>
+              <w:left w:val="single" w:sz="4" w:space="0" w:color="000000"/>
+              <w:bottom w:val="single" w:sz="4" w:space="0" w:color="000000"/>
+              <w:right w:val="single" w:sz="4" w:space="0" w:color="000000"/>
+            </w:tcBorders>
+          </w:tcPr>
+          <w:p>
+            <w:r>
+              <w:t>10</w:t>
+            </w:r>
+          </w:p>
+        </w:tc>
+      </w:tr>
+      <w:tr>
+        <w:trPr>
+          <w:trHeight w:val="313"/>
+        </w:trPr>
+        <w:tc>
+          <w:tcPr>
+            <w:tcW w:w="6181" w:type="dxa"/>
+            <w:tcBorders>
+              <w:top w:val="single" w:sz="4" w:space="0" w:color="000000"/>
+              <w:left w:val="single" w:sz="4" w:space="0" w:color="000000"/>
+              <w:bottom w:val="single" w:sz="4" w:space="0" w:color="000000"/>
+              <w:right w:val="single" w:sz="4" w:space="0" w:color="000000"/>
+            </w:tcBorders>
+          </w:tcPr>
+          <w:p>
+            <w:r>
+              <w:t>Audit weekly logs</w:t>
+            </w:r>
+          </w:p>
+        </w:tc>
+        <w:tc>
+          <w:tcPr>
+            <w:tcW w:w="1652" w:type="dxa"/>
+            <w:tcBorders>
+              <w:top w:val="single" w:sz="4" w:space="0" w:color="000000"/>
+              <w:left w:val="single" w:sz="4" w:space="0" w:color="000000"/>
+              <w:bottom w:val="single" w:sz="4" w:space="0" w:color="000000"/>
+              <w:right w:val="single" w:sz="4" w:space="0" w:color="000000"/>
+            </w:tcBorders>
+          </w:tcPr>
+          <w:p>
+            <w:r>
+              <w:t>DS</w:t>
+            </w:r>
+          </w:p>
+        </w:tc>
+        <w:tc>
+          <w:tcPr>
+            <w:tcW w:w="1529" w:type="dxa"/>
+            <w:tcBorders>
+              <w:top w:val="single" w:sz="4" w:space="0" w:color="000000"/>
+              <w:left w:val="single" w:sz="4" w:space="0" w:color="000000"/>
+              <w:bottom w:val="single" w:sz="4" w:space="0" w:color="000000"/>
+              <w:right w:val="single" w:sz="4" w:space="0" w:color="000000"/>
+            </w:tcBorders>
+          </w:tcPr>
+          <w:p>
+            <w:r>
+              <w:t>10</w:t>
+            </w:r>
+          </w:p>
+        </w:tc>
+      </w:tr>
+      <w:tr>
+        <w:trPr>
+          <w:trHeight w:val="313"/>
+        </w:trPr>
+        <w:tc>
+          <w:tcPr>
+            <w:tcW w:w="6181" w:type="dxa"/>
+            <w:tcBorders>
+              <w:top w:val="single" w:sz="4" w:space="0" w:color="000000"/>
+              <w:left w:val="single" w:sz="4" w:space="0" w:color="000000"/>
+              <w:bottom w:val="single" w:sz="4" w:space="0" w:color="000000"/>
+              <w:right w:val="single" w:sz="4" w:space="0" w:color="000000"/>
+            </w:tcBorders>
+          </w:tcPr>
+          <w:p>
+            <w:r>
+              <w:t>Proposal changes</w:t>
+            </w:r>
+          </w:p>
+        </w:tc>
+        <w:tc>
+          <w:tcPr>
+            <w:tcW w:w="1652" w:type="dxa"/>
+            <w:tcBorders>
+              <w:top w:val="single" w:sz="4" w:space="0" w:color="000000"/>
+              <w:left w:val="single" w:sz="4" w:space="0" w:color="000000"/>
+              <w:bottom w:val="single" w:sz="4" w:space="0" w:color="000000"/>
+              <w:right w:val="single" w:sz="4" w:space="0" w:color="000000"/>
+            </w:tcBorders>
+          </w:tcPr>
+          <w:p>
+            <w:r>
               <w:t>SD</w:t>
             </w:r>
           </w:p>
@@ -782,7 +903,7 @@
           </w:tcPr>
           <w:p>
             <w:r>
-              <w:t>15</w:t>
+              <w:t>10</w:t>
             </w:r>
           </w:p>
         </w:tc>
@@ -970,7 +1091,6 @@
               <w:rPr>
                 <w:b/>
               </w:rPr>
-              <w:lastRenderedPageBreak/>
               <w:t xml:space="preserve">MEETING NOTES: </w:t>
             </w:r>
           </w:p>
@@ -1000,25 +1120,7 @@
               <w:rPr>
                 <w:bCs/>
               </w:rPr>
-              <w:t>-</w:t>
-            </w:r>
-            <w:r>
-              <w:rPr>
-                <w:bCs/>
-              </w:rPr>
-              <w:t>We have two members sick</w:t>
-            </w:r>
-            <w:r>
-              <w:rPr>
-                <w:bCs/>
-              </w:rPr>
-              <w:t>, discuss compensatory</w:t>
-            </w:r>
-            <w:r>
-              <w:rPr>
-                <w:bCs/>
-              </w:rPr>
-              <w:t xml:space="preserve"> hours</w:t>
+              <w:t>-Discussion on what tools we have looked at and what we got working</w:t>
             </w:r>
           </w:p>
           <w:p>
@@ -1031,7 +1133,7 @@
               <w:rPr>
                 <w:bCs/>
               </w:rPr>
-              <w:t>-Dave can work on setting up Trello boards for kanban</w:t>
+              <w:t>- Scheduling a meeting with clement/discussing the need for a meeting – key points we want to ask could just be an email</w:t>
             </w:r>
           </w:p>
           <w:p>
@@ -1044,7 +1146,7 @@
               <w:rPr>
                 <w:bCs/>
               </w:rPr>
-              <w:t>-We need to start getting hands on and familiar with ai forensics tools even without access to the machine at school</w:t>
+              <w:t>- We need to define each tool in the proposal, the version, what they do, and what they look for</w:t>
             </w:r>
           </w:p>
           <w:p>
@@ -1057,7 +1159,7 @@
               <w:rPr>
                 <w:bCs/>
               </w:rPr>
-              <w:t>-Matt and sam will see if they can get “Valhuntir” and “Unfold” working</w:t>
+              <w:t>- Explain to a layman the idea behind the project, where AI fits in and how, as well as what forensic artifacts are and their many forms.</w:t>
             </w:r>
           </w:p>
           <w:p>
@@ -1070,7 +1172,7 @@
               <w:rPr>
                 <w:bCs/>
               </w:rPr>
-              <w:t>-Finalizing weekly logs, auditing, correcting anomalies</w:t>
+              <w:t>-Explain the difference between a forensic examiner and a forensic investigator.</w:t>
             </w:r>
           </w:p>
           <w:p>
@@ -1083,7 +1185,47 @@
               <w:rPr>
                 <w:bCs/>
               </w:rPr>
-              <w:t>- Sam showing off sqlite ai model in lmstudio, we discuss the role lmstudio has as a model client</w:t>
+              <w:t>- Compiled weekly logs</w:t>
+            </w:r>
+          </w:p>
+          <w:p>
+            <w:pPr>
+              <w:rPr>
+                <w:bCs/>
+              </w:rPr>
+            </w:pPr>
+            <w:r>
+              <w:rPr>
+                <w:bCs/>
+              </w:rPr>
+              <w:t>- Compiling work on git</w:t>
+            </w:r>
+          </w:p>
+          <w:p>
+            <w:pPr>
+              <w:rPr>
+                <w:bCs/>
+              </w:rPr>
+            </w:pPr>
+            <w:r>
+              <w:rPr>
+                <w:bCs/>
+              </w:rPr>
+              <w:t xml:space="preserve">- Checking over </w:t>
+            </w:r>
+            <w:proofErr w:type="spellStart"/>
+            <w:r>
+              <w:rPr>
+                <w:bCs/>
+              </w:rPr>
+              <w:t>sam’s</w:t>
+            </w:r>
+            <w:proofErr w:type="spellEnd"/>
+            <w:r>
+              <w:rPr>
+                <w:bCs/>
+              </w:rPr>
+              <w:t xml:space="preserve"> proposal changes</w:t>
             </w:r>
           </w:p>
         </w:tc>
@@ -1138,7 +1280,13 @@
               <w:t xml:space="preserve">Will be </w:t>
             </w:r>
             <w:r>
-              <w:t>Tuesday next week 10-11AM</w:t>
+              <w:t>Tuesday next</w:t>
+            </w:r>
+            <w:r>
+              <w:t xml:space="preserve"> </w:t>
+            </w:r>
+            <w:r>
+              <w:t>week 10-11AM</w:t>
             </w:r>
           </w:p>
         </w:tc>
@@ -1180,7 +1328,7 @@
               <w:rPr>
                 <w:bCs/>
               </w:rPr>
-              <w:t>N/A</w:t>
+              <w:t>25/08/26</w:t>
             </w:r>
           </w:p>
         </w:tc>
@@ -1205,7 +1353,7 @@
               <w:rPr>
                 <w:bCs/>
               </w:rPr>
-              <w:t>N/A</w:t>
+              <w:t>10-11</w:t>
             </w:r>
           </w:p>
         </w:tc>
@@ -1520,7 +1668,7 @@
       <w:t xml:space="preserve">BDSH [Week </w:t>
     </w:r>
     <w:r>
-      <w:t>5</w:t>
+      <w:t>6</w:t>
     </w:r>
     <w:r>
       <w:t xml:space="preserve">] </w:t>

</xml_diff>

<commit_message>
Rearranging files for change of PM
</commit_message>
<xml_diff>
--- a/Meeting_Minutes/Team meetings/Team Meeting Minutes Week 6.docx
+++ b/Meeting_Minutes/Team meetings/Team Meeting Minutes Week 6.docx
@@ -1,6 +1,6 @@
 
 <file path=word/document.xml><?xml version="1.0" encoding="utf-8"?>
-<w:document xmlns:wpc="http://schemas.microsoft.com/office/word/2010/wordprocessingCanvas" xmlns:cx="http://schemas.microsoft.com/office/drawing/2014/chartex" xmlns:cx1="http://schemas.microsoft.com/office/drawing/2015/9/8/chartex" xmlns:cx2="http://schemas.microsoft.com/office/drawing/2015/10/21/chartex" xmlns:cx3="http://schemas.microsoft.com/office/drawing/2016/5/9/chartex" xmlns:cx4="http://schemas.microsoft.com/office/drawing/2016/5/10/chartex" xmlns:cx5="http://schemas.microsoft.com/office/drawing/2016/5/11/chartex" xmlns:cx6="http://schemas.microsoft.com/office/drawing/2016/5/12/chartex" xmlns:cx7="http://schemas.microsoft.com/office/drawing/2016/5/13/chartex" xmlns:cx8="http://schemas.microsoft.com/office/drawing/2016/5/14/chartex" xmlns:mc="http://schemas.openxmlformats.org/markup-compatibility/2006" xmlns:aink="http://schemas.microsoft.com/office/drawing/2016/ink" xmlns:am3d="http://schemas.microsoft.com/office/drawing/2017/model3d" xmlns:o="urn:schemas-microsoft-com:office:office" xmlns:oel="http://schemas.microsoft.com/office/2019/extlst" xmlns:r="http://schemas.openxmlformats.org/officeDocument/2006/relationships" xmlns:m="http://schemas.openxmlformats.org/officeDocument/2006/math" xmlns:v="urn:schemas-microsoft-com:vml" xmlns:wp14="http://schemas.microsoft.com/office/word/2010/wordprocessingDrawing" xmlns:wp="http://schemas.openxmlformats.org/drawingml/2006/wordprocessingDrawing" xmlns:w10="urn:schemas-microsoft-com:office:word" xmlns:w="http://schemas.openxmlformats.org/wordprocessingml/2006/main" xmlns:w14="http://schemas.microsoft.com/office/word/2010/wordml" xmlns:w15="http://schemas.microsoft.com/office/word/2012/wordml" xmlns:w16cei="http://schemas.microsoft.com/office/word/2026/wordml/cei" xmlns:w16cex="http://schemas.microsoft.com/office/word/2018/wordml/cex" xmlns:w16cid="http://schemas.microsoft.com/office/word/2016/wordml/cid" xmlns:w16="http://schemas.microsoft.com/office/word/2018/wordml" xmlns:w16du="http://schemas.microsoft.com/office/word/2023/wordml/word16du" xmlns:w16sdtdh="http://schemas.microsoft.com/office/word/2020/wordml/sdtdatahash" xmlns:w16sdtfl="http://schemas.microsoft.com/office/word/2024/wordml/sdtformatlock" xmlns:w16se="http://schemas.microsoft.com/office/word/2015/wordml/symex" xmlns:wpg="http://schemas.microsoft.com/office/word/2010/wordprocessingGroup" xmlns:wpi="http://schemas.microsoft.com/office/word/2010/wordprocessingInk" xmlns:wne="http://schemas.microsoft.com/office/word/2006/wordml" xmlns:wps="http://schemas.microsoft.com/office/word/2010/wordprocessingShape" mc:Ignorable="w14 w15 w16se w16cid w16 w16cex w16sdtdh w16sdtfl w16du wp14">
+<w:document xmlns:wpc="http://schemas.microsoft.com/office/word/2010/wordprocessingCanvas" xmlns:cx="http://schemas.microsoft.com/office/drawing/2014/chartex" xmlns:cx1="http://schemas.microsoft.com/office/drawing/2015/9/8/chartex" xmlns:cx2="http://schemas.microsoft.com/office/drawing/2015/10/21/chartex" xmlns:cx3="http://schemas.microsoft.com/office/drawing/2016/5/9/chartex" xmlns:cx4="http://schemas.microsoft.com/office/drawing/2016/5/10/chartex" xmlns:cx5="http://schemas.microsoft.com/office/drawing/2016/5/11/chartex" xmlns:cx6="http://schemas.microsoft.com/office/drawing/2016/5/12/chartex" xmlns:cx7="http://schemas.microsoft.com/office/drawing/2016/5/13/chartex" xmlns:cx8="http://schemas.microsoft.com/office/drawing/2016/5/14/chartex" xmlns:mc="http://schemas.openxmlformats.org/markup-compatibility/2006" xmlns:aink="http://schemas.microsoft.com/office/drawing/2016/ink" xmlns:am3d="http://schemas.microsoft.com/office/drawing/2017/model3d" xmlns:o="urn:schemas-microsoft-com:office:office" xmlns:oel="http://schemas.microsoft.com/office/2019/extlst" xmlns:r="http://schemas.openxmlformats.org/officeDocument/2006/relationships" xmlns:m="http://schemas.openxmlformats.org/officeDocument/2006/math" xmlns:v="urn:schemas-microsoft-com:vml" xmlns:wp14="http://schemas.microsoft.com/office/word/2010/wordprocessingDrawing" xmlns:wp="http://schemas.openxmlformats.org/drawingml/2006/wordprocessingDrawing" xmlns:w10="urn:schemas-microsoft-com:office:word" xmlns:w="http://schemas.openxmlformats.org/wordprocessingml/2006/main" xmlns:w14="http://schemas.microsoft.com/office/word/2010/wordml" xmlns:w15="http://schemas.microsoft.com/office/word/2012/wordml" xmlns:w16cex="http://schemas.microsoft.com/office/word/2018/wordml/cex" xmlns:w16cid="http://schemas.microsoft.com/office/word/2016/wordml/cid" xmlns:w16="http://schemas.microsoft.com/office/word/2018/wordml" xmlns:w16du="http://schemas.microsoft.com/office/word/2023/wordml/word16du" xmlns:w16sdtdh="http://schemas.microsoft.com/office/word/2020/wordml/sdtdatahash" xmlns:w16sdtfl="http://schemas.microsoft.com/office/word/2024/wordml/sdtformatlock" xmlns:w16se="http://schemas.microsoft.com/office/word/2015/wordml/symex" xmlns:wpg="http://schemas.microsoft.com/office/word/2010/wordprocessingGroup" xmlns:wpi="http://schemas.microsoft.com/office/word/2010/wordprocessingInk" xmlns:wne="http://schemas.microsoft.com/office/word/2006/wordml" xmlns:wps="http://schemas.microsoft.com/office/word/2010/wordprocessingShape" mc:Ignorable="w14 w15 w16se w16cid w16 w16cex w16sdtdh w16sdtfl w16du wp14">
   <w:body>
     <w:p>
       <w:pPr>
@@ -378,30 +378,6 @@
               </w:rPr>
               <w:t xml:space="preserve">PROJECT PURPOSE:  </w:t>
             </w:r>
-            <w:r>
-              <w:rPr>
-                <w:bCs/>
-              </w:rPr>
-              <w:t xml:space="preserve">Provide an empirical analysis </w:t>
-            </w:r>
-            <w:r>
-              <w:rPr>
-                <w:bCs/>
-              </w:rPr>
-              <w:t xml:space="preserve">on AI </w:t>
-            </w:r>
-            <w:r>
-              <w:rPr>
-                <w:bCs/>
-              </w:rPr>
-              <w:t>digital forensics technologies</w:t>
-            </w:r>
-            <w:r>
-              <w:rPr>
-                <w:bCs/>
-              </w:rPr>
-              <w:t xml:space="preserve"> </w:t>
-            </w:r>
           </w:p>
         </w:tc>
       </w:tr>
@@ -1484,7 +1460,7 @@
 </file>
 
 <file path=word/endnotes.xml><?xml version="1.0" encoding="utf-8"?>
-<w:endnotes xmlns:wpc="http://schemas.microsoft.com/office/word/2010/wordprocessingCanvas" xmlns:cx="http://schemas.microsoft.com/office/drawing/2014/chartex" xmlns:cx1="http://schemas.microsoft.com/office/drawing/2015/9/8/chartex" xmlns:cx2="http://schemas.microsoft.com/office/drawing/2015/10/21/chartex" xmlns:cx3="http://schemas.microsoft.com/office/drawing/2016/5/9/chartex" xmlns:cx4="http://schemas.microsoft.com/office/drawing/2016/5/10/chartex" xmlns:cx5="http://schemas.microsoft.com/office/drawing/2016/5/11/chartex" xmlns:cx6="http://schemas.microsoft.com/office/drawing/2016/5/12/chartex" xmlns:cx7="http://schemas.microsoft.com/office/drawing/2016/5/13/chartex" xmlns:cx8="http://schemas.microsoft.com/office/drawing/2016/5/14/chartex" xmlns:mc="http://schemas.openxmlformats.org/markup-compatibility/2006" xmlns:aink="http://schemas.microsoft.com/office/drawing/2016/ink" xmlns:am3d="http://schemas.microsoft.com/office/drawing/2017/model3d" xmlns:o="urn:schemas-microsoft-com:office:office" xmlns:oel="http://schemas.microsoft.com/office/2019/extlst" xmlns:r="http://schemas.openxmlformats.org/officeDocument/2006/relationships" xmlns:m="http://schemas.openxmlformats.org/officeDocument/2006/math" xmlns:v="urn:schemas-microsoft-com:vml" xmlns:wp14="http://schemas.microsoft.com/office/word/2010/wordprocessingDrawing" xmlns:wp="http://schemas.openxmlformats.org/drawingml/2006/wordprocessingDrawing" xmlns:w10="urn:schemas-microsoft-com:office:word" xmlns:w="http://schemas.openxmlformats.org/wordprocessingml/2006/main" xmlns:w14="http://schemas.microsoft.com/office/word/2010/wordml" xmlns:w15="http://schemas.microsoft.com/office/word/2012/wordml" xmlns:w16cei="http://schemas.microsoft.com/office/word/2026/wordml/cei" xmlns:w16cex="http://schemas.microsoft.com/office/word/2018/wordml/cex" xmlns:w16cid="http://schemas.microsoft.com/office/word/2016/wordml/cid" xmlns:w16="http://schemas.microsoft.com/office/word/2018/wordml" xmlns:w16du="http://schemas.microsoft.com/office/word/2023/wordml/word16du" xmlns:w16sdtdh="http://schemas.microsoft.com/office/word/2020/wordml/sdtdatahash" xmlns:w16sdtfl="http://schemas.microsoft.com/office/word/2024/wordml/sdtformatlock" xmlns:w16se="http://schemas.microsoft.com/office/word/2015/wordml/symex" xmlns:wpg="http://schemas.microsoft.com/office/word/2010/wordprocessingGroup" xmlns:wpi="http://schemas.microsoft.com/office/word/2010/wordprocessingInk" xmlns:wne="http://schemas.microsoft.com/office/word/2006/wordml" xmlns:wps="http://schemas.microsoft.com/office/word/2010/wordprocessingShape" mc:Ignorable="w14 w15 w16se w16cid w16 w16cex w16sdtdh w16sdtfl w16du wp14">
+<w:endnotes xmlns:wpc="http://schemas.microsoft.com/office/word/2010/wordprocessingCanvas" xmlns:cx="http://schemas.microsoft.com/office/drawing/2014/chartex" xmlns:cx1="http://schemas.microsoft.com/office/drawing/2015/9/8/chartex" xmlns:cx2="http://schemas.microsoft.com/office/drawing/2015/10/21/chartex" xmlns:cx3="http://schemas.microsoft.com/office/drawing/2016/5/9/chartex" xmlns:cx4="http://schemas.microsoft.com/office/drawing/2016/5/10/chartex" xmlns:cx5="http://schemas.microsoft.com/office/drawing/2016/5/11/chartex" xmlns:cx6="http://schemas.microsoft.com/office/drawing/2016/5/12/chartex" xmlns:cx7="http://schemas.microsoft.com/office/drawing/2016/5/13/chartex" xmlns:cx8="http://schemas.microsoft.com/office/drawing/2016/5/14/chartex" xmlns:mc="http://schemas.openxmlformats.org/markup-compatibility/2006" xmlns:aink="http://schemas.microsoft.com/office/drawing/2016/ink" xmlns:am3d="http://schemas.microsoft.com/office/drawing/2017/model3d" xmlns:o="urn:schemas-microsoft-com:office:office" xmlns:oel="http://schemas.microsoft.com/office/2019/extlst" xmlns:r="http://schemas.openxmlformats.org/officeDocument/2006/relationships" xmlns:m="http://schemas.openxmlformats.org/officeDocument/2006/math" xmlns:v="urn:schemas-microsoft-com:vml" xmlns:wp14="http://schemas.microsoft.com/office/word/2010/wordprocessingDrawing" xmlns:wp="http://schemas.openxmlformats.org/drawingml/2006/wordprocessingDrawing" xmlns:w10="urn:schemas-microsoft-com:office:word" xmlns:w="http://schemas.openxmlformats.org/wordprocessingml/2006/main" xmlns:w14="http://schemas.microsoft.com/office/word/2010/wordml" xmlns:w15="http://schemas.microsoft.com/office/word/2012/wordml" xmlns:w16cex="http://schemas.microsoft.com/office/word/2018/wordml/cex" xmlns:w16cid="http://schemas.microsoft.com/office/word/2016/wordml/cid" xmlns:w16="http://schemas.microsoft.com/office/word/2018/wordml" xmlns:w16du="http://schemas.microsoft.com/office/word/2023/wordml/word16du" xmlns:w16sdtdh="http://schemas.microsoft.com/office/word/2020/wordml/sdtdatahash" xmlns:w16sdtfl="http://schemas.microsoft.com/office/word/2024/wordml/sdtformatlock" xmlns:w16se="http://schemas.microsoft.com/office/word/2015/wordml/symex" xmlns:wpg="http://schemas.microsoft.com/office/word/2010/wordprocessingGroup" xmlns:wpi="http://schemas.microsoft.com/office/word/2010/wordprocessingInk" xmlns:wne="http://schemas.microsoft.com/office/word/2006/wordml" xmlns:wps="http://schemas.microsoft.com/office/word/2010/wordprocessingShape" mc:Ignorable="w14 w15 w16se w16cid w16 w16cex w16sdtdh w16sdtfl w16du wp14">
   <w:endnote w:type="separator" w:id="-1">
     <w:p>
       <w:pPr>
@@ -1509,7 +1485,7 @@
 </file>
 
 <file path=word/footer1.xml><?xml version="1.0" encoding="utf-8"?>
-<w:ftr xmlns:wpc="http://schemas.microsoft.com/office/word/2010/wordprocessingCanvas" xmlns:cx="http://schemas.microsoft.com/office/drawing/2014/chartex" xmlns:cx1="http://schemas.microsoft.com/office/drawing/2015/9/8/chartex" xmlns:cx2="http://schemas.microsoft.com/office/drawing/2015/10/21/chartex" xmlns:cx3="http://schemas.microsoft.com/office/drawing/2016/5/9/chartex" xmlns:cx4="http://schemas.microsoft.com/office/drawing/2016/5/10/chartex" xmlns:cx5="http://schemas.microsoft.com/office/drawing/2016/5/11/chartex" xmlns:cx6="http://schemas.microsoft.com/office/drawing/2016/5/12/chartex" xmlns:cx7="http://schemas.microsoft.com/office/drawing/2016/5/13/chartex" xmlns:cx8="http://schemas.microsoft.com/office/drawing/2016/5/14/chartex" xmlns:mc="http://schemas.openxmlformats.org/markup-compatibility/2006" xmlns:aink="http://schemas.microsoft.com/office/drawing/2016/ink" xmlns:am3d="http://schemas.microsoft.com/office/drawing/2017/model3d" xmlns:o="urn:schemas-microsoft-com:office:office" xmlns:oel="http://schemas.microsoft.com/office/2019/extlst" xmlns:r="http://schemas.openxmlformats.org/officeDocument/2006/relationships" xmlns:m="http://schemas.openxmlformats.org/officeDocument/2006/math" xmlns:v="urn:schemas-microsoft-com:vml" xmlns:wp14="http://schemas.microsoft.com/office/word/2010/wordprocessingDrawing" xmlns:wp="http://schemas.openxmlformats.org/drawingml/2006/wordprocessingDrawing" xmlns:w10="urn:schemas-microsoft-com:office:word" xmlns:w="http://schemas.openxmlformats.org/wordprocessingml/2006/main" xmlns:w14="http://schemas.microsoft.com/office/word/2010/wordml" xmlns:w15="http://schemas.microsoft.com/office/word/2012/wordml" xmlns:w16cei="http://schemas.microsoft.com/office/word/2026/wordml/cei" xmlns:w16cex="http://schemas.microsoft.com/office/word/2018/wordml/cex" xmlns:w16cid="http://schemas.microsoft.com/office/word/2016/wordml/cid" xmlns:w16="http://schemas.microsoft.com/office/word/2018/wordml" xmlns:w16du="http://schemas.microsoft.com/office/word/2023/wordml/word16du" xmlns:w16sdtdh="http://schemas.microsoft.com/office/word/2020/wordml/sdtdatahash" xmlns:w16sdtfl="http://schemas.microsoft.com/office/word/2024/wordml/sdtformatlock" xmlns:w16se="http://schemas.microsoft.com/office/word/2015/wordml/symex" xmlns:wpg="http://schemas.microsoft.com/office/word/2010/wordprocessingGroup" xmlns:wpi="http://schemas.microsoft.com/office/word/2010/wordprocessingInk" xmlns:wne="http://schemas.microsoft.com/office/word/2006/wordml" xmlns:wps="http://schemas.microsoft.com/office/word/2010/wordprocessingShape" mc:Ignorable="w14 w15 w16se w16cid w16 w16cex w16sdtdh w16sdtfl w16du wp14">
+<w:ftr xmlns:wpc="http://schemas.microsoft.com/office/word/2010/wordprocessingCanvas" xmlns:cx="http://schemas.microsoft.com/office/drawing/2014/chartex" xmlns:cx1="http://schemas.microsoft.com/office/drawing/2015/9/8/chartex" xmlns:cx2="http://schemas.microsoft.com/office/drawing/2015/10/21/chartex" xmlns:cx3="http://schemas.microsoft.com/office/drawing/2016/5/9/chartex" xmlns:cx4="http://schemas.microsoft.com/office/drawing/2016/5/10/chartex" xmlns:cx5="http://schemas.microsoft.com/office/drawing/2016/5/11/chartex" xmlns:cx6="http://schemas.microsoft.com/office/drawing/2016/5/12/chartex" xmlns:cx7="http://schemas.microsoft.com/office/drawing/2016/5/13/chartex" xmlns:cx8="http://schemas.microsoft.com/office/drawing/2016/5/14/chartex" xmlns:mc="http://schemas.openxmlformats.org/markup-compatibility/2006" xmlns:aink="http://schemas.microsoft.com/office/drawing/2016/ink" xmlns:am3d="http://schemas.microsoft.com/office/drawing/2017/model3d" xmlns:o="urn:schemas-microsoft-com:office:office" xmlns:oel="http://schemas.microsoft.com/office/2019/extlst" xmlns:r="http://schemas.openxmlformats.org/officeDocument/2006/relationships" xmlns:m="http://schemas.openxmlformats.org/officeDocument/2006/math" xmlns:v="urn:schemas-microsoft-com:vml" xmlns:wp14="http://schemas.microsoft.com/office/word/2010/wordprocessingDrawing" xmlns:wp="http://schemas.openxmlformats.org/drawingml/2006/wordprocessingDrawing" xmlns:w10="urn:schemas-microsoft-com:office:word" xmlns:w="http://schemas.openxmlformats.org/wordprocessingml/2006/main" xmlns:w14="http://schemas.microsoft.com/office/word/2010/wordml" xmlns:w15="http://schemas.microsoft.com/office/word/2012/wordml" xmlns:w16cex="http://schemas.microsoft.com/office/word/2018/wordml/cex" xmlns:w16cid="http://schemas.microsoft.com/office/word/2016/wordml/cid" xmlns:w16="http://schemas.microsoft.com/office/word/2018/wordml" xmlns:w16du="http://schemas.microsoft.com/office/word/2023/wordml/word16du" xmlns:w16sdtdh="http://schemas.microsoft.com/office/word/2020/wordml/sdtdatahash" xmlns:w16sdtfl="http://schemas.microsoft.com/office/word/2024/wordml/sdtformatlock" xmlns:w16se="http://schemas.microsoft.com/office/word/2015/wordml/symex" xmlns:wpg="http://schemas.microsoft.com/office/word/2010/wordprocessingGroup" xmlns:wpi="http://schemas.microsoft.com/office/word/2010/wordprocessingInk" xmlns:wne="http://schemas.microsoft.com/office/word/2006/wordml" xmlns:wps="http://schemas.microsoft.com/office/word/2010/wordprocessingShape" mc:Ignorable="w14 w15 w16se w16cid w16 w16cex w16sdtdh w16sdtfl w16du wp14">
   <w:sdt>
     <w:sdtPr>
       <w:id w:val="1906339634"/>
@@ -1637,7 +1613,7 @@
 </file>
 
 <file path=word/footnotes.xml><?xml version="1.0" encoding="utf-8"?>
-<w:footnotes xmlns:wpc="http://schemas.microsoft.com/office/word/2010/wordprocessingCanvas" xmlns:cx="http://schemas.microsoft.com/office/drawing/2014/chartex" xmlns:cx1="http://schemas.microsoft.com/office/drawing/2015/9/8/chartex" xmlns:cx2="http://schemas.microsoft.com/office/drawing/2015/10/21/chartex" xmlns:cx3="http://schemas.microsoft.com/office/drawing/2016/5/9/chartex" xmlns:cx4="http://schemas.microsoft.com/office/drawing/2016/5/10/chartex" xmlns:cx5="http://schemas.microsoft.com/office/drawing/2016/5/11/chartex" xmlns:cx6="http://schemas.microsoft.com/office/drawing/2016/5/12/chartex" xmlns:cx7="http://schemas.microsoft.com/office/drawing/2016/5/13/chartex" xmlns:cx8="http://schemas.microsoft.com/office/drawing/2016/5/14/chartex" xmlns:mc="http://schemas.openxmlformats.org/markup-compatibility/2006" xmlns:aink="http://schemas.microsoft.com/office/drawing/2016/ink" xmlns:am3d="http://schemas.microsoft.com/office/drawing/2017/model3d" xmlns:o="urn:schemas-microsoft-com:office:office" xmlns:oel="http://schemas.microsoft.com/office/2019/extlst" xmlns:r="http://schemas.openxmlformats.org/officeDocument/2006/relationships" xmlns:m="http://schemas.openxmlformats.org/officeDocument/2006/math" xmlns:v="urn:schemas-microsoft-com:vml" xmlns:wp14="http://schemas.microsoft.com/office/word/2010/wordprocessingDrawing" xmlns:wp="http://schemas.openxmlformats.org/drawingml/2006/wordprocessingDrawing" xmlns:w10="urn:schemas-microsoft-com:office:word" xmlns:w="http://schemas.openxmlformats.org/wordprocessingml/2006/main" xmlns:w14="http://schemas.microsoft.com/office/word/2010/wordml" xmlns:w15="http://schemas.microsoft.com/office/word/2012/wordml" xmlns:w16cei="http://schemas.microsoft.com/office/word/2026/wordml/cei" xmlns:w16cex="http://schemas.microsoft.com/office/word/2018/wordml/cex" xmlns:w16cid="http://schemas.microsoft.com/office/word/2016/wordml/cid" xmlns:w16="http://schemas.microsoft.com/office/word/2018/wordml" xmlns:w16du="http://schemas.microsoft.com/office/word/2023/wordml/word16du" xmlns:w16sdtdh="http://schemas.microsoft.com/office/word/2020/wordml/sdtdatahash" xmlns:w16sdtfl="http://schemas.microsoft.com/office/word/2024/wordml/sdtformatlock" xmlns:w16se="http://schemas.microsoft.com/office/word/2015/wordml/symex" xmlns:wpg="http://schemas.microsoft.com/office/word/2010/wordprocessingGroup" xmlns:wpi="http://schemas.microsoft.com/office/word/2010/wordprocessingInk" xmlns:wne="http://schemas.microsoft.com/office/word/2006/wordml" xmlns:wps="http://schemas.microsoft.com/office/word/2010/wordprocessingShape" mc:Ignorable="w14 w15 w16se w16cid w16 w16cex w16sdtdh w16sdtfl w16du wp14">
+<w:footnotes xmlns:wpc="http://schemas.microsoft.com/office/word/2010/wordprocessingCanvas" xmlns:cx="http://schemas.microsoft.com/office/drawing/2014/chartex" xmlns:cx1="http://schemas.microsoft.com/office/drawing/2015/9/8/chartex" xmlns:cx2="http://schemas.microsoft.com/office/drawing/2015/10/21/chartex" xmlns:cx3="http://schemas.microsoft.com/office/drawing/2016/5/9/chartex" xmlns:cx4="http://schemas.microsoft.com/office/drawing/2016/5/10/chartex" xmlns:cx5="http://schemas.microsoft.com/office/drawing/2016/5/11/chartex" xmlns:cx6="http://schemas.microsoft.com/office/drawing/2016/5/12/chartex" xmlns:cx7="http://schemas.microsoft.com/office/drawing/2016/5/13/chartex" xmlns:cx8="http://schemas.microsoft.com/office/drawing/2016/5/14/chartex" xmlns:mc="http://schemas.openxmlformats.org/markup-compatibility/2006" xmlns:aink="http://schemas.microsoft.com/office/drawing/2016/ink" xmlns:am3d="http://schemas.microsoft.com/office/drawing/2017/model3d" xmlns:o="urn:schemas-microsoft-com:office:office" xmlns:oel="http://schemas.microsoft.com/office/2019/extlst" xmlns:r="http://schemas.openxmlformats.org/officeDocument/2006/relationships" xmlns:m="http://schemas.openxmlformats.org/officeDocument/2006/math" xmlns:v="urn:schemas-microsoft-com:vml" xmlns:wp14="http://schemas.microsoft.com/office/word/2010/wordprocessingDrawing" xmlns:wp="http://schemas.openxmlformats.org/drawingml/2006/wordprocessingDrawing" xmlns:w10="urn:schemas-microsoft-com:office:word" xmlns:w="http://schemas.openxmlformats.org/wordprocessingml/2006/main" xmlns:w14="http://schemas.microsoft.com/office/word/2010/wordml" xmlns:w15="http://schemas.microsoft.com/office/word/2012/wordml" xmlns:w16cex="http://schemas.microsoft.com/office/word/2018/wordml/cex" xmlns:w16cid="http://schemas.microsoft.com/office/word/2016/wordml/cid" xmlns:w16="http://schemas.microsoft.com/office/word/2018/wordml" xmlns:w16du="http://schemas.microsoft.com/office/word/2023/wordml/word16du" xmlns:w16sdtdh="http://schemas.microsoft.com/office/word/2020/wordml/sdtdatahash" xmlns:w16sdtfl="http://schemas.microsoft.com/office/word/2024/wordml/sdtformatlock" xmlns:w16se="http://schemas.microsoft.com/office/word/2015/wordml/symex" xmlns:wpg="http://schemas.microsoft.com/office/word/2010/wordprocessingGroup" xmlns:wpi="http://schemas.microsoft.com/office/word/2010/wordprocessingInk" xmlns:wne="http://schemas.microsoft.com/office/word/2006/wordml" xmlns:wps="http://schemas.microsoft.com/office/word/2010/wordprocessingShape" mc:Ignorable="w14 w15 w16se w16cid w16 w16cex w16sdtdh w16sdtfl w16du wp14">
   <w:footnote w:type="separator" w:id="-1">
     <w:p>
       <w:pPr>
@@ -1662,7 +1638,7 @@
 </file>
 
 <file path=word/header1.xml><?xml version="1.0" encoding="utf-8"?>
-<w:hdr xmlns:wpc="http://schemas.microsoft.com/office/word/2010/wordprocessingCanvas" xmlns:cx="http://schemas.microsoft.com/office/drawing/2014/chartex" xmlns:cx1="http://schemas.microsoft.com/office/drawing/2015/9/8/chartex" xmlns:cx2="http://schemas.microsoft.com/office/drawing/2015/10/21/chartex" xmlns:cx3="http://schemas.microsoft.com/office/drawing/2016/5/9/chartex" xmlns:cx4="http://schemas.microsoft.com/office/drawing/2016/5/10/chartex" xmlns:cx5="http://schemas.microsoft.com/office/drawing/2016/5/11/chartex" xmlns:cx6="http://schemas.microsoft.com/office/drawing/2016/5/12/chartex" xmlns:cx7="http://schemas.microsoft.com/office/drawing/2016/5/13/chartex" xmlns:cx8="http://schemas.microsoft.com/office/drawing/2016/5/14/chartex" xmlns:mc="http://schemas.openxmlformats.org/markup-compatibility/2006" xmlns:aink="http://schemas.microsoft.com/office/drawing/2016/ink" xmlns:am3d="http://schemas.microsoft.com/office/drawing/2017/model3d" xmlns:o="urn:schemas-microsoft-com:office:office" xmlns:oel="http://schemas.microsoft.com/office/2019/extlst" xmlns:r="http://schemas.openxmlformats.org/officeDocument/2006/relationships" xmlns:m="http://schemas.openxmlformats.org/officeDocument/2006/math" xmlns:v="urn:schemas-microsoft-com:vml" xmlns:wp14="http://schemas.microsoft.com/office/word/2010/wordprocessingDrawing" xmlns:wp="http://schemas.openxmlformats.org/drawingml/2006/wordprocessingDrawing" xmlns:w10="urn:schemas-microsoft-com:office:word" xmlns:w="http://schemas.openxmlformats.org/wordprocessingml/2006/main" xmlns:w14="http://schemas.microsoft.com/office/word/2010/wordml" xmlns:w15="http://schemas.microsoft.com/office/word/2012/wordml" xmlns:w16cei="http://schemas.microsoft.com/office/word/2026/wordml/cei" xmlns:w16cex="http://schemas.microsoft.com/office/word/2018/wordml/cex" xmlns:w16cid="http://schemas.microsoft.com/office/word/2016/wordml/cid" xmlns:w16="http://schemas.microsoft.com/office/word/2018/wordml" xmlns:w16du="http://schemas.microsoft.com/office/word/2023/wordml/word16du" xmlns:w16sdtdh="http://schemas.microsoft.com/office/word/2020/wordml/sdtdatahash" xmlns:w16sdtfl="http://schemas.microsoft.com/office/word/2024/wordml/sdtformatlock" xmlns:w16se="http://schemas.microsoft.com/office/word/2015/wordml/symex" xmlns:wpg="http://schemas.microsoft.com/office/word/2010/wordprocessingGroup" xmlns:wpi="http://schemas.microsoft.com/office/word/2010/wordprocessingInk" xmlns:wne="http://schemas.microsoft.com/office/word/2006/wordml" xmlns:wps="http://schemas.microsoft.com/office/word/2010/wordprocessingShape" mc:Ignorable="w14 w15 w16se w16cid w16 w16cex w16sdtdh w16sdtfl w16du wp14">
+<w:hdr xmlns:wpc="http://schemas.microsoft.com/office/word/2010/wordprocessingCanvas" xmlns:cx="http://schemas.microsoft.com/office/drawing/2014/chartex" xmlns:cx1="http://schemas.microsoft.com/office/drawing/2015/9/8/chartex" xmlns:cx2="http://schemas.microsoft.com/office/drawing/2015/10/21/chartex" xmlns:cx3="http://schemas.microsoft.com/office/drawing/2016/5/9/chartex" xmlns:cx4="http://schemas.microsoft.com/office/drawing/2016/5/10/chartex" xmlns:cx5="http://schemas.microsoft.com/office/drawing/2016/5/11/chartex" xmlns:cx6="http://schemas.microsoft.com/office/drawing/2016/5/12/chartex" xmlns:cx7="http://schemas.microsoft.com/office/drawing/2016/5/13/chartex" xmlns:cx8="http://schemas.microsoft.com/office/drawing/2016/5/14/chartex" xmlns:mc="http://schemas.openxmlformats.org/markup-compatibility/2006" xmlns:aink="http://schemas.microsoft.com/office/drawing/2016/ink" xmlns:am3d="http://schemas.microsoft.com/office/drawing/2017/model3d" xmlns:o="urn:schemas-microsoft-com:office:office" xmlns:oel="http://schemas.microsoft.com/office/2019/extlst" xmlns:r="http://schemas.openxmlformats.org/officeDocument/2006/relationships" xmlns:m="http://schemas.openxmlformats.org/officeDocument/2006/math" xmlns:v="urn:schemas-microsoft-com:vml" xmlns:wp14="http://schemas.microsoft.com/office/word/2010/wordprocessingDrawing" xmlns:wp="http://schemas.openxmlformats.org/drawingml/2006/wordprocessingDrawing" xmlns:w10="urn:schemas-microsoft-com:office:word" xmlns:w="http://schemas.openxmlformats.org/wordprocessingml/2006/main" xmlns:w14="http://schemas.microsoft.com/office/word/2010/wordml" xmlns:w15="http://schemas.microsoft.com/office/word/2012/wordml" xmlns:w16cex="http://schemas.microsoft.com/office/word/2018/wordml/cex" xmlns:w16cid="http://schemas.microsoft.com/office/word/2016/wordml/cid" xmlns:w16="http://schemas.microsoft.com/office/word/2018/wordml" xmlns:w16du="http://schemas.microsoft.com/office/word/2023/wordml/word16du" xmlns:w16sdtdh="http://schemas.microsoft.com/office/word/2020/wordml/sdtdatahash" xmlns:w16sdtfl="http://schemas.microsoft.com/office/word/2024/wordml/sdtformatlock" xmlns:w16se="http://schemas.microsoft.com/office/word/2015/wordml/symex" xmlns:wpg="http://schemas.microsoft.com/office/word/2010/wordprocessingGroup" xmlns:wpi="http://schemas.microsoft.com/office/word/2010/wordprocessingInk" xmlns:wne="http://schemas.microsoft.com/office/word/2006/wordml" xmlns:wps="http://schemas.microsoft.com/office/word/2010/wordprocessingShape" mc:Ignorable="w14 w15 w16se w16cid w16 w16cex w16sdtdh w16sdtfl w16du wp14">
   <w:p>
     <w:pPr>
       <w:tabs>
@@ -1694,7 +1670,7 @@
 </file>
 
 <file path=word/numbering.xml><?xml version="1.0" encoding="utf-8"?>
-<w:numbering xmlns:wpc="http://schemas.microsoft.com/office/word/2010/wordprocessingCanvas" xmlns:cx="http://schemas.microsoft.com/office/drawing/2014/chartex" xmlns:cx1="http://schemas.microsoft.com/office/drawing/2015/9/8/chartex" xmlns:cx2="http://schemas.microsoft.com/office/drawing/2015/10/21/chartex" xmlns:cx3="http://schemas.microsoft.com/office/drawing/2016/5/9/chartex" xmlns:cx4="http://schemas.microsoft.com/office/drawing/2016/5/10/chartex" xmlns:cx5="http://schemas.microsoft.com/office/drawing/2016/5/11/chartex" xmlns:cx6="http://schemas.microsoft.com/office/drawing/2016/5/12/chartex" xmlns:cx7="http://schemas.microsoft.com/office/drawing/2016/5/13/chartex" xmlns:cx8="http://schemas.microsoft.com/office/drawing/2016/5/14/chartex" xmlns:mc="http://schemas.openxmlformats.org/markup-compatibility/2006" xmlns:aink="http://schemas.microsoft.com/office/drawing/2016/ink" xmlns:am3d="http://schemas.microsoft.com/office/drawing/2017/model3d" xmlns:o="urn:schemas-microsoft-com:office:office" xmlns:oel="http://schemas.microsoft.com/office/2019/extlst" xmlns:r="http://schemas.openxmlformats.org/officeDocument/2006/relationships" xmlns:m="http://schemas.openxmlformats.org/officeDocument/2006/math" xmlns:v="urn:schemas-microsoft-com:vml" xmlns:wp14="http://schemas.microsoft.com/office/word/2010/wordprocessingDrawing" xmlns:wp="http://schemas.openxmlformats.org/drawingml/2006/wordprocessingDrawing" xmlns:w10="urn:schemas-microsoft-com:office:word" xmlns:w="http://schemas.openxmlformats.org/wordprocessingml/2006/main" xmlns:w14="http://schemas.microsoft.com/office/word/2010/wordml" xmlns:w15="http://schemas.microsoft.com/office/word/2012/wordml" xmlns:w16cei="http://schemas.microsoft.com/office/word/2026/wordml/cei" xmlns:w16cex="http://schemas.microsoft.com/office/word/2018/wordml/cex" xmlns:w16cid="http://schemas.microsoft.com/office/word/2016/wordml/cid" xmlns:w16="http://schemas.microsoft.com/office/word/2018/wordml" xmlns:w16du="http://schemas.microsoft.com/office/word/2023/wordml/word16du" xmlns:w16sdtdh="http://schemas.microsoft.com/office/word/2020/wordml/sdtdatahash" xmlns:w16sdtfl="http://schemas.microsoft.com/office/word/2024/wordml/sdtformatlock" xmlns:w16se="http://schemas.microsoft.com/office/word/2015/wordml/symex" xmlns:wpg="http://schemas.microsoft.com/office/word/2010/wordprocessingGroup" xmlns:wpi="http://schemas.microsoft.com/office/word/2010/wordprocessingInk" xmlns:wne="http://schemas.microsoft.com/office/word/2006/wordml" xmlns:wps="http://schemas.microsoft.com/office/word/2010/wordprocessingShape" mc:Ignorable="w14 w15 w16se w16cid w16 w16cex w16sdtdh w16sdtfl w16du wp14">
+<w:numbering xmlns:wpc="http://schemas.microsoft.com/office/word/2010/wordprocessingCanvas" xmlns:cx="http://schemas.microsoft.com/office/drawing/2014/chartex" xmlns:cx1="http://schemas.microsoft.com/office/drawing/2015/9/8/chartex" xmlns:cx2="http://schemas.microsoft.com/office/drawing/2015/10/21/chartex" xmlns:cx3="http://schemas.microsoft.com/office/drawing/2016/5/9/chartex" xmlns:cx4="http://schemas.microsoft.com/office/drawing/2016/5/10/chartex" xmlns:cx5="http://schemas.microsoft.com/office/drawing/2016/5/11/chartex" xmlns:cx6="http://schemas.microsoft.com/office/drawing/2016/5/12/chartex" xmlns:cx7="http://schemas.microsoft.com/office/drawing/2016/5/13/chartex" xmlns:cx8="http://schemas.microsoft.com/office/drawing/2016/5/14/chartex" xmlns:mc="http://schemas.openxmlformats.org/markup-compatibility/2006" xmlns:aink="http://schemas.microsoft.com/office/drawing/2016/ink" xmlns:am3d="http://schemas.microsoft.com/office/drawing/2017/model3d" xmlns:o="urn:schemas-microsoft-com:office:office" xmlns:oel="http://schemas.microsoft.com/office/2019/extlst" xmlns:r="http://schemas.openxmlformats.org/officeDocument/2006/relationships" xmlns:m="http://schemas.openxmlformats.org/officeDocument/2006/math" xmlns:v="urn:schemas-microsoft-com:vml" xmlns:wp14="http://schemas.microsoft.com/office/word/2010/wordprocessingDrawing" xmlns:wp="http://schemas.openxmlformats.org/drawingml/2006/wordprocessingDrawing" xmlns:w10="urn:schemas-microsoft-com:office:word" xmlns:w="http://schemas.openxmlformats.org/wordprocessingml/2006/main" xmlns:w14="http://schemas.microsoft.com/office/word/2010/wordml" xmlns:w15="http://schemas.microsoft.com/office/word/2012/wordml" xmlns:w16cex="http://schemas.microsoft.com/office/word/2018/wordml/cex" xmlns:w16cid="http://schemas.microsoft.com/office/word/2016/wordml/cid" xmlns:w16="http://schemas.microsoft.com/office/word/2018/wordml" xmlns:w16du="http://schemas.microsoft.com/office/word/2023/wordml/word16du" xmlns:w16sdtdh="http://schemas.microsoft.com/office/word/2020/wordml/sdtdatahash" xmlns:w16sdtfl="http://schemas.microsoft.com/office/word/2024/wordml/sdtformatlock" xmlns:w16se="http://schemas.microsoft.com/office/word/2015/wordml/symex" xmlns:wpg="http://schemas.microsoft.com/office/word/2010/wordprocessingGroup" xmlns:wpi="http://schemas.microsoft.com/office/word/2010/wordprocessingInk" xmlns:wne="http://schemas.microsoft.com/office/word/2006/wordml" xmlns:wps="http://schemas.microsoft.com/office/word/2010/wordprocessingShape" mc:Ignorable="w14 w15 w16se w16cid w16 w16cex w16sdtdh w16sdtfl w16du wp14">
   <w:abstractNum w:abstractNumId="0" w15:restartNumberingAfterBreak="0">
     <w:nsid w:val="5F3C5C15"/>
     <w:multiLevelType w:val="hybridMultilevel"/>

</xml_diff>